<commit_message>
docs: add coverage reporting and long-term evidence schema verifiability
- OPlanning: explicitly record what was excluded from Review/Verification
  scope and why (CoverageReport), so a scoped result is never presented as
  a complete one
- Case Dashboard/Delivery: always surface excluded components and reasons
- OEvidence: bind schema_version to Evidence Metadata and commit to keeping
  backward-compatible verification tooling for the life of the retention
  period, instead of letting old evidence become unverifiable
- Regenerate docs/master/doc/*.docx

Co-Authored-By: Claude Sonnet 5 <noreply@anthropic.com>
</commit_message>
<xml_diff>
--- a/docs/master/doc/02_FUNCTIONAL_REQUIREMENTS_AND_PROGRAMS.docx
+++ b/docs/master/doc/02_FUNCTIONAL_REQUIREMENTS_AND_PROGRAMS.docx
@@ -10,7 +10,7 @@
         <w:t xml:space="preserve">02_FUNCTIONAL_REQUIREMENTS_AND_PROGRAMS</w:t>
       </w:r>
     </w:p>
-    <w:bookmarkStart w:id="60" w:name="onsure-기능-요구사항-및-프로그램-명세"/>
+    <w:bookmarkStart w:id="61" w:name="onsure-기능-요구사항-및-프로그램-명세"/>
     <w:p>
       <w:pPr>
         <w:pStyle w:val="Heading1"/>
@@ -525,7 +525,7 @@
     </w:p>
     <w:bookmarkEnd w:id="25"/>
     <w:bookmarkEnd w:id="26"/>
-    <w:bookmarkStart w:id="30" w:name="oplanning"/>
+    <w:bookmarkStart w:id="31" w:name="oplanning"/>
     <w:p>
       <w:pPr>
         <w:pStyle w:val="Heading2"/>
@@ -657,6 +657,18 @@
         <w:t xml:space="preserve">사용자 승인용 Plan Diff 제공</w:t>
       </w:r>
     </w:p>
+    <w:p>
+      <w:pPr>
+        <w:numPr>
+          <w:ilvl w:val="0"/>
+          <w:numId w:val="1005"/>
+        </w:numPr>
+        <w:pStyle w:val="Compact"/>
+      </w:pPr>
+      <w:r>
+        <w:t xml:space="preserve">위험 기반으로 범위를 좁힐 때 무엇을 이번 Review/Verification 대상에서 제외했는지와 제외 사유를 명시적으로 기록(Coverage Report)</w:t>
+      </w:r>
+    </w:p>
     <w:bookmarkEnd w:id="28"/>
     <w:bookmarkStart w:id="29" w:name="산출물-1"/>
     <w:p>
@@ -672,12 +684,49 @@
         <w:pStyle w:val="FirstParagraph"/>
       </w:pPr>
       <w:r>
-        <w:t xml:space="preserve">ExecutionPlan, ScopeManifest, ScenarioPlan, ResourceEstimate, ApprovalReceipt</w:t>
+        <w:t xml:space="preserve">ExecutionPlan, ScopeManifest, ScenarioPlan, ResourceEstimate, ApprovalReceipt, CoverageReport</w:t>
       </w:r>
     </w:p>
     <w:bookmarkEnd w:id="29"/>
+    <w:bookmarkStart w:id="30" w:name="수용기준-1"/>
+    <w:p>
+      <w:pPr>
+        <w:pStyle w:val="Heading3"/>
+      </w:pPr>
+      <w:r>
+        <w:t xml:space="preserve">수용기준</w:t>
+      </w:r>
+    </w:p>
+    <w:p>
+      <w:pPr>
+        <w:numPr>
+          <w:ilvl w:val="0"/>
+          <w:numId w:val="1006"/>
+        </w:numPr>
+        <w:pStyle w:val="Compact"/>
+      </w:pPr>
+      <w:r>
+        <w:t xml:space="preserve">CoverageReport 없이</w:t>
+      </w:r>
+      <w:r>
+        <w:t xml:space="preserve"> </w:t>
+      </w:r>
+      <w:r>
+        <w:t xml:space="preserve">“</w:t>
+      </w:r>
+      <w:r>
+        <w:t xml:space="preserve">전체 검토 완료</w:t>
+      </w:r>
+      <w:r>
+        <w:t xml:space="preserve">”</w:t>
+      </w:r>
+      <w:r>
+        <w:t xml:space="preserve">로 표현하지 않는다. 제외된 Component가 있으면 Case Dashboard와 Delivery에 항상 노출한다</w:t>
+      </w:r>
+    </w:p>
     <w:bookmarkEnd w:id="30"/>
-    <w:bookmarkStart w:id="36" w:name="oreview"/>
+    <w:bookmarkEnd w:id="31"/>
+    <w:bookmarkStart w:id="37" w:name="oreview"/>
     <w:p>
       <w:pPr>
         <w:pStyle w:val="Heading2"/>
@@ -686,7 +735,7 @@
         <w:t xml:space="preserve">5. OReview</w:t>
       </w:r>
     </w:p>
-    <w:bookmarkStart w:id="31" w:name="review-영역"/>
+    <w:bookmarkStart w:id="32" w:name="review-영역"/>
     <w:p>
       <w:pPr>
         <w:pStyle w:val="Heading3"/>
@@ -703,8 +752,8 @@
         <w:t xml:space="preserve">Requirement, Architecture, Design, Policy, Code, AI, Security, Performance, Test, Quality, Merge</w:t>
       </w:r>
     </w:p>
-    <w:bookmarkEnd w:id="31"/>
-    <w:bookmarkStart w:id="32" w:name="기능-2"/>
+    <w:bookmarkEnd w:id="32"/>
+    <w:bookmarkStart w:id="33" w:name="기능-2"/>
     <w:p>
       <w:pPr>
         <w:pStyle w:val="Heading3"/>
@@ -717,7 +766,7 @@
       <w:pPr>
         <w:numPr>
           <w:ilvl w:val="0"/>
-          <w:numId w:val="1006"/>
+          <w:numId w:val="1007"/>
         </w:numPr>
         <w:pStyle w:val="Compact"/>
       </w:pPr>
@@ -729,7 +778,7 @@
       <w:pPr>
         <w:numPr>
           <w:ilvl w:val="0"/>
-          <w:numId w:val="1006"/>
+          <w:numId w:val="1007"/>
         </w:numPr>
         <w:pStyle w:val="Compact"/>
       </w:pPr>
@@ -741,7 +790,7 @@
       <w:pPr>
         <w:numPr>
           <w:ilvl w:val="0"/>
-          <w:numId w:val="1006"/>
+          <w:numId w:val="1007"/>
         </w:numPr>
         <w:pStyle w:val="Compact"/>
       </w:pPr>
@@ -753,7 +802,7 @@
       <w:pPr>
         <w:numPr>
           <w:ilvl w:val="0"/>
-          <w:numId w:val="1006"/>
+          <w:numId w:val="1007"/>
         </w:numPr>
         <w:pStyle w:val="Compact"/>
       </w:pPr>
@@ -765,7 +814,7 @@
       <w:pPr>
         <w:numPr>
           <w:ilvl w:val="0"/>
-          <w:numId w:val="1006"/>
+          <w:numId w:val="1007"/>
         </w:numPr>
         <w:pStyle w:val="Compact"/>
       </w:pPr>
@@ -777,7 +826,7 @@
       <w:pPr>
         <w:numPr>
           <w:ilvl w:val="0"/>
-          <w:numId w:val="1006"/>
+          <w:numId w:val="1007"/>
         </w:numPr>
         <w:pStyle w:val="Compact"/>
       </w:pPr>
@@ -789,7 +838,7 @@
       <w:pPr>
         <w:numPr>
           <w:ilvl w:val="0"/>
-          <w:numId w:val="1006"/>
+          <w:numId w:val="1007"/>
         </w:numPr>
         <w:pStyle w:val="Compact"/>
       </w:pPr>
@@ -801,7 +850,7 @@
       <w:pPr>
         <w:numPr>
           <w:ilvl w:val="0"/>
-          <w:numId w:val="1006"/>
+          <w:numId w:val="1007"/>
         </w:numPr>
         <w:pStyle w:val="Compact"/>
       </w:pPr>
@@ -813,7 +862,7 @@
       <w:pPr>
         <w:numPr>
           <w:ilvl w:val="0"/>
-          <w:numId w:val="1006"/>
+          <w:numId w:val="1007"/>
         </w:numPr>
         <w:pStyle w:val="Compact"/>
       </w:pPr>
@@ -825,7 +874,7 @@
       <w:pPr>
         <w:numPr>
           <w:ilvl w:val="0"/>
-          <w:numId w:val="1006"/>
+          <w:numId w:val="1007"/>
         </w:numPr>
         <w:pStyle w:val="Compact"/>
       </w:pPr>
@@ -837,7 +886,7 @@
       <w:pPr>
         <w:numPr>
           <w:ilvl w:val="0"/>
-          <w:numId w:val="1006"/>
+          <w:numId w:val="1007"/>
         </w:numPr>
         <w:pStyle w:val="Compact"/>
       </w:pPr>
@@ -845,8 +894,8 @@
         <w:t xml:space="preserve">독립 Review Pass 지원(가능한 경우 원 구현에 사용된 모델과 다른 계열의 모델로 수행)</w:t>
       </w:r>
     </w:p>
-    <w:bookmarkEnd w:id="32"/>
-    <w:bookmarkStart w:id="33" w:name="decision"/>
+    <w:bookmarkEnd w:id="33"/>
+    <w:bookmarkStart w:id="34" w:name="decision"/>
     <w:p>
       <w:pPr>
         <w:pStyle w:val="Heading3"/>
@@ -863,8 +912,8 @@
         <w:t xml:space="preserve">APPROVE, COMMENT, REQUEST_CHANGE, REJECT, NOT_APPLICABLE, INCONCLUSIVE</w:t>
       </w:r>
     </w:p>
-    <w:bookmarkEnd w:id="33"/>
-    <w:bookmarkStart w:id="35" w:name="수용기준-1"/>
+    <w:bookmarkEnd w:id="34"/>
+    <w:bookmarkStart w:id="36" w:name="수용기준-2"/>
     <w:p>
       <w:pPr>
         <w:pStyle w:val="Heading3"/>
@@ -877,7 +926,7 @@
       <w:pPr>
         <w:numPr>
           <w:ilvl w:val="0"/>
-          <w:numId w:val="1007"/>
+          <w:numId w:val="1008"/>
         </w:numPr>
         <w:pStyle w:val="Compact"/>
       </w:pPr>
@@ -889,7 +938,7 @@
       <w:pPr>
         <w:numPr>
           <w:ilvl w:val="0"/>
-          <w:numId w:val="1007"/>
+          <w:numId w:val="1008"/>
         </w:numPr>
         <w:pStyle w:val="Compact"/>
       </w:pPr>
@@ -901,7 +950,7 @@
       <w:pPr>
         <w:numPr>
           <w:ilvl w:val="0"/>
-          <w:numId w:val="1007"/>
+          <w:numId w:val="1008"/>
         </w:numPr>
         <w:pStyle w:val="Compact"/>
       </w:pPr>
@@ -913,7 +962,7 @@
       <w:pPr>
         <w:numPr>
           <w:ilvl w:val="0"/>
-          <w:numId w:val="1007"/>
+          <w:numId w:val="1008"/>
         </w:numPr>
         <w:pStyle w:val="Compact"/>
       </w:pPr>
@@ -925,14 +974,14 @@
       <w:pPr>
         <w:numPr>
           <w:ilvl w:val="0"/>
-          <w:numId w:val="1007"/>
+          <w:numId w:val="1008"/>
         </w:numPr>
         <w:pStyle w:val="Compact"/>
       </w:pPr>
       <w:r>
         <w:t xml:space="preserve">Critical Finding은 원 구현/1차 판정과 다른 모델 계열의 Cross-Model Verification을 거친 뒤에만 최종 확정한다(</w:t>
       </w:r>
-      <w:hyperlink r:id="rId34">
+      <w:hyperlink r:id="rId35">
         <w:r>
           <w:rPr>
             <w:rStyle w:val="Hyperlink"/>
@@ -951,7 +1000,7 @@
       <w:pPr>
         <w:numPr>
           <w:ilvl w:val="0"/>
-          <w:numId w:val="1007"/>
+          <w:numId w:val="1008"/>
         </w:numPr>
         <w:pStyle w:val="Compact"/>
       </w:pPr>
@@ -963,7 +1012,7 @@
       <w:pPr>
         <w:numPr>
           <w:ilvl w:val="0"/>
-          <w:numId w:val="1007"/>
+          <w:numId w:val="1008"/>
         </w:numPr>
         <w:pStyle w:val="Compact"/>
       </w:pPr>
@@ -971,9 +1020,9 @@
         <w:t xml:space="preserve">Human/Professional Reviewer의 판정도 자동판정과 동등하게 품질관리 대상이다. Golden Review Fixture에 대한 Reviewer 판정 정확도를 주기적으로 측정하고, 특정 Reviewer의 정확도가 지속적으로 기준 미달이면 배정을 제한한다</w:t>
       </w:r>
     </w:p>
-    <w:bookmarkEnd w:id="35"/>
     <w:bookmarkEnd w:id="36"/>
-    <w:bookmarkStart w:id="40" w:name="overification"/>
+    <w:bookmarkEnd w:id="37"/>
+    <w:bookmarkStart w:id="41" w:name="overification"/>
     <w:p>
       <w:pPr>
         <w:pStyle w:val="Heading2"/>
@@ -982,7 +1031,7 @@
         <w:t xml:space="preserve">6. OVerification</w:t>
       </w:r>
     </w:p>
-    <w:bookmarkStart w:id="37" w:name="기능-3"/>
+    <w:bookmarkStart w:id="38" w:name="기능-3"/>
     <w:p>
       <w:pPr>
         <w:pStyle w:val="Heading3"/>
@@ -995,7 +1044,7 @@
       <w:pPr>
         <w:numPr>
           <w:ilvl w:val="0"/>
-          <w:numId w:val="1008"/>
+          <w:numId w:val="1009"/>
         </w:numPr>
         <w:pStyle w:val="Compact"/>
       </w:pPr>
@@ -1007,7 +1056,7 @@
       <w:pPr>
         <w:numPr>
           <w:ilvl w:val="0"/>
-          <w:numId w:val="1008"/>
+          <w:numId w:val="1009"/>
         </w:numPr>
         <w:pStyle w:val="Compact"/>
       </w:pPr>
@@ -1019,7 +1068,7 @@
       <w:pPr>
         <w:numPr>
           <w:ilvl w:val="0"/>
-          <w:numId w:val="1008"/>
+          <w:numId w:val="1009"/>
         </w:numPr>
         <w:pStyle w:val="Compact"/>
       </w:pPr>
@@ -1031,7 +1080,7 @@
       <w:pPr>
         <w:numPr>
           <w:ilvl w:val="0"/>
-          <w:numId w:val="1008"/>
+          <w:numId w:val="1009"/>
         </w:numPr>
         <w:pStyle w:val="Compact"/>
       </w:pPr>
@@ -1043,7 +1092,7 @@
       <w:pPr>
         <w:numPr>
           <w:ilvl w:val="0"/>
-          <w:numId w:val="1008"/>
+          <w:numId w:val="1009"/>
         </w:numPr>
         <w:pStyle w:val="Compact"/>
       </w:pPr>
@@ -1085,7 +1134,7 @@
       <w:pPr>
         <w:numPr>
           <w:ilvl w:val="0"/>
-          <w:numId w:val="1008"/>
+          <w:numId w:val="1009"/>
         </w:numPr>
         <w:pStyle w:val="Compact"/>
       </w:pPr>
@@ -1097,7 +1146,7 @@
       <w:pPr>
         <w:numPr>
           <w:ilvl w:val="0"/>
-          <w:numId w:val="1008"/>
+          <w:numId w:val="1009"/>
         </w:numPr>
         <w:pStyle w:val="Compact"/>
       </w:pPr>
@@ -1109,7 +1158,7 @@
       <w:pPr>
         <w:numPr>
           <w:ilvl w:val="0"/>
-          <w:numId w:val="1008"/>
+          <w:numId w:val="1009"/>
         </w:numPr>
         <w:pStyle w:val="Compact"/>
       </w:pPr>
@@ -1121,7 +1170,7 @@
       <w:pPr>
         <w:numPr>
           <w:ilvl w:val="0"/>
-          <w:numId w:val="1008"/>
+          <w:numId w:val="1009"/>
         </w:numPr>
         <w:pStyle w:val="Compact"/>
       </w:pPr>
@@ -1129,8 +1178,8 @@
         <w:t xml:space="preserve">독립 OTester/OAudit 판정 지원</w:t>
       </w:r>
     </w:p>
-    <w:bookmarkEnd w:id="37"/>
-    <w:bookmarkStart w:id="38" w:name="decision-1"/>
+    <w:bookmarkEnd w:id="38"/>
+    <w:bookmarkStart w:id="39" w:name="decision-1"/>
     <w:p>
       <w:pPr>
         <w:pStyle w:val="Heading3"/>
@@ -1147,8 +1196,8 @@
         <w:t xml:space="preserve">PASS, FAIL, BLOCKED, NOT_RUN, INCONCLUSIVE, NON_FINAL</w:t>
       </w:r>
     </w:p>
-    <w:bookmarkEnd w:id="38"/>
-    <w:bookmarkStart w:id="39" w:name="수용기준-2"/>
+    <w:bookmarkEnd w:id="39"/>
+    <w:bookmarkStart w:id="40" w:name="수용기준-3"/>
     <w:p>
       <w:pPr>
         <w:pStyle w:val="Heading3"/>
@@ -1195,9 +1244,9 @@
         <w:t xml:space="preserve">을 구분해 표기한다(테스트가 없어서 통과한 것을 테스트가 충분해서 통과한 것처럼 보이지 않게 한다).</w:t>
       </w:r>
     </w:p>
-    <w:bookmarkEnd w:id="39"/>
     <w:bookmarkEnd w:id="40"/>
-    <w:bookmarkStart w:id="43" w:name="oimprovement"/>
+    <w:bookmarkEnd w:id="41"/>
+    <w:bookmarkStart w:id="44" w:name="oimprovement"/>
     <w:p>
       <w:pPr>
         <w:pStyle w:val="Heading2"/>
@@ -1206,7 +1255,7 @@
         <w:t xml:space="preserve">7. OImprovement</w:t>
       </w:r>
     </w:p>
-    <w:bookmarkStart w:id="41" w:name="기능-4"/>
+    <w:bookmarkStart w:id="42" w:name="기능-4"/>
     <w:p>
       <w:pPr>
         <w:pStyle w:val="Heading3"/>
@@ -1219,7 +1268,7 @@
       <w:pPr>
         <w:numPr>
           <w:ilvl w:val="0"/>
-          <w:numId w:val="1009"/>
+          <w:numId w:val="1010"/>
         </w:numPr>
         <w:pStyle w:val="Compact"/>
       </w:pPr>
@@ -1231,7 +1280,7 @@
       <w:pPr>
         <w:numPr>
           <w:ilvl w:val="0"/>
-          <w:numId w:val="1009"/>
+          <w:numId w:val="1010"/>
         </w:numPr>
         <w:pStyle w:val="Compact"/>
       </w:pPr>
@@ -1243,7 +1292,7 @@
       <w:pPr>
         <w:numPr>
           <w:ilvl w:val="0"/>
-          <w:numId w:val="1009"/>
+          <w:numId w:val="1010"/>
         </w:numPr>
         <w:pStyle w:val="Compact"/>
       </w:pPr>
@@ -1255,7 +1304,7 @@
       <w:pPr>
         <w:numPr>
           <w:ilvl w:val="0"/>
-          <w:numId w:val="1009"/>
+          <w:numId w:val="1010"/>
         </w:numPr>
         <w:pStyle w:val="Compact"/>
       </w:pPr>
@@ -1267,7 +1316,7 @@
       <w:pPr>
         <w:numPr>
           <w:ilvl w:val="0"/>
-          <w:numId w:val="1009"/>
+          <w:numId w:val="1010"/>
         </w:numPr>
         <w:pStyle w:val="Compact"/>
       </w:pPr>
@@ -1279,7 +1328,7 @@
       <w:pPr>
         <w:numPr>
           <w:ilvl w:val="0"/>
-          <w:numId w:val="1009"/>
+          <w:numId w:val="1010"/>
         </w:numPr>
         <w:pStyle w:val="Compact"/>
       </w:pPr>
@@ -1291,7 +1340,7 @@
       <w:pPr>
         <w:numPr>
           <w:ilvl w:val="0"/>
-          <w:numId w:val="1009"/>
+          <w:numId w:val="1010"/>
         </w:numPr>
         <w:pStyle w:val="Compact"/>
       </w:pPr>
@@ -1303,7 +1352,7 @@
       <w:pPr>
         <w:numPr>
           <w:ilvl w:val="0"/>
-          <w:numId w:val="1009"/>
+          <w:numId w:val="1010"/>
         </w:numPr>
         <w:pStyle w:val="Compact"/>
       </w:pPr>
@@ -1315,7 +1364,7 @@
       <w:pPr>
         <w:numPr>
           <w:ilvl w:val="0"/>
-          <w:numId w:val="1009"/>
+          <w:numId w:val="1010"/>
         </w:numPr>
         <w:pStyle w:val="Compact"/>
       </w:pPr>
@@ -1327,7 +1376,7 @@
       <w:pPr>
         <w:numPr>
           <w:ilvl w:val="0"/>
-          <w:numId w:val="1009"/>
+          <w:numId w:val="1010"/>
         </w:numPr>
         <w:pStyle w:val="Compact"/>
       </w:pPr>
@@ -1335,8 +1384,8 @@
         <w:t xml:space="preserve">Rollback 또는 Abandon</w:t>
       </w:r>
     </w:p>
-    <w:bookmarkEnd w:id="41"/>
-    <w:bookmarkStart w:id="42" w:name="금지"/>
+    <w:bookmarkEnd w:id="42"/>
+    <w:bookmarkStart w:id="43" w:name="금지"/>
     <w:p>
       <w:pPr>
         <w:pStyle w:val="Heading3"/>
@@ -1349,7 +1398,7 @@
       <w:pPr>
         <w:numPr>
           <w:ilvl w:val="0"/>
-          <w:numId w:val="1010"/>
+          <w:numId w:val="1011"/>
         </w:numPr>
         <w:pStyle w:val="Compact"/>
       </w:pPr>
@@ -1361,7 +1410,7 @@
       <w:pPr>
         <w:numPr>
           <w:ilvl w:val="0"/>
-          <w:numId w:val="1010"/>
+          <w:numId w:val="1011"/>
         </w:numPr>
         <w:pStyle w:val="Compact"/>
       </w:pPr>
@@ -1373,7 +1422,7 @@
       <w:pPr>
         <w:numPr>
           <w:ilvl w:val="0"/>
-          <w:numId w:val="1010"/>
+          <w:numId w:val="1011"/>
         </w:numPr>
         <w:pStyle w:val="Compact"/>
       </w:pPr>
@@ -1385,7 +1434,7 @@
       <w:pPr>
         <w:numPr>
           <w:ilvl w:val="0"/>
-          <w:numId w:val="1010"/>
+          <w:numId w:val="1011"/>
         </w:numPr>
         <w:pStyle w:val="Compact"/>
       </w:pPr>
@@ -1397,7 +1446,7 @@
       <w:pPr>
         <w:numPr>
           <w:ilvl w:val="0"/>
-          <w:numId w:val="1010"/>
+          <w:numId w:val="1011"/>
         </w:numPr>
         <w:pStyle w:val="Compact"/>
       </w:pPr>
@@ -1405,9 +1454,9 @@
         <w:t xml:space="preserve">정책 Gate 우회</w:t>
       </w:r>
     </w:p>
-    <w:bookmarkEnd w:id="42"/>
     <w:bookmarkEnd w:id="43"/>
-    <w:bookmarkStart w:id="49" w:name="omemory"/>
+    <w:bookmarkEnd w:id="44"/>
+    <w:bookmarkStart w:id="50" w:name="omemory"/>
     <w:p>
       <w:pPr>
         <w:pStyle w:val="Heading2"/>
@@ -1416,7 +1465,7 @@
         <w:t xml:space="preserve">7-1. OMemory</w:t>
       </w:r>
     </w:p>
-    <w:bookmarkStart w:id="44" w:name="책임-2"/>
+    <w:bookmarkStart w:id="45" w:name="책임-2"/>
     <w:p>
       <w:pPr>
         <w:pStyle w:val="Heading3"/>
@@ -1433,8 +1482,8 @@
         <w:t xml:space="preserve">OReview, OVerification, OImprovement의 실행 결과와 Before/After Evidence에서 재사용 가능한 지식을 추출·검증하여 이후 Learning, Planning, Review, Verification, Improvement에 근거 있는 신호로 제공한다. 자동 판정이 놓친 결함을 재귀학습으로 흡수해 탐지 능력을 지속적으로 보강한다.</w:t>
       </w:r>
     </w:p>
-    <w:bookmarkEnd w:id="44"/>
-    <w:bookmarkStart w:id="45" w:name="기능-지식-축적"/>
+    <w:bookmarkEnd w:id="45"/>
+    <w:bookmarkStart w:id="46" w:name="기능-지식-축적"/>
     <w:p>
       <w:pPr>
         <w:pStyle w:val="Heading3"/>
@@ -1447,7 +1496,7 @@
       <w:pPr>
         <w:numPr>
           <w:ilvl w:val="0"/>
-          <w:numId w:val="1011"/>
+          <w:numId w:val="1012"/>
         </w:numPr>
         <w:pStyle w:val="Compact"/>
       </w:pPr>
@@ -1459,7 +1508,7 @@
       <w:pPr>
         <w:numPr>
           <w:ilvl w:val="0"/>
-          <w:numId w:val="1011"/>
+          <w:numId w:val="1012"/>
         </w:numPr>
         <w:pStyle w:val="Compact"/>
       </w:pPr>
@@ -1471,14 +1520,14 @@
       <w:pPr>
         <w:numPr>
           <w:ilvl w:val="0"/>
-          <w:numId w:val="1011"/>
+          <w:numId w:val="1012"/>
         </w:numPr>
         <w:pStyle w:val="Compact"/>
       </w:pPr>
       <w:r>
         <w:t xml:space="preserve">AI/바이브 코딩 특유 패턴 별도 태깅: Hallucinated Dependency, Prompt Injection 방어 누락, 과잉 생성, Silent Error Swallowing, Test 없는 대량 커밋 등 (</w:t>
       </w:r>
-      <w:hyperlink r:id="rId34">
+      <w:hyperlink r:id="rId35">
         <w:r>
           <w:rPr>
             <w:rStyle w:val="Hyperlink"/>
@@ -1494,7 +1543,7 @@
       <w:pPr>
         <w:numPr>
           <w:ilvl w:val="0"/>
-          <w:numId w:val="1011"/>
+          <w:numId w:val="1012"/>
         </w:numPr>
         <w:pStyle w:val="Compact"/>
       </w:pPr>
@@ -1506,7 +1555,7 @@
       <w:pPr>
         <w:numPr>
           <w:ilvl w:val="0"/>
-          <w:numId w:val="1011"/>
+          <w:numId w:val="1012"/>
         </w:numPr>
         <w:pStyle w:val="Compact"/>
       </w:pPr>
@@ -1518,7 +1567,7 @@
       <w:pPr>
         <w:numPr>
           <w:ilvl w:val="0"/>
-          <w:numId w:val="1011"/>
+          <w:numId w:val="1012"/>
         </w:numPr>
         <w:pStyle w:val="Compact"/>
       </w:pPr>
@@ -1530,7 +1579,7 @@
       <w:pPr>
         <w:numPr>
           <w:ilvl w:val="0"/>
-          <w:numId w:val="1011"/>
+          <w:numId w:val="1012"/>
         </w:numPr>
         <w:pStyle w:val="Compact"/>
       </w:pPr>
@@ -1538,8 +1587,8 @@
         <w:t xml:space="preserve">재현 3회 이상 실패(False Positive)한 Pattern은 자동 강등</w:t>
       </w:r>
     </w:p>
-    <w:bookmarkEnd w:id="45"/>
-    <w:bookmarkStart w:id="46" w:name="기능-재귀학습recursive-detection-learning"/>
+    <w:bookmarkEnd w:id="46"/>
+    <w:bookmarkStart w:id="47" w:name="기능-재귀학습recursive-detection-learning"/>
     <w:p>
       <w:pPr>
         <w:pStyle w:val="Heading3"/>
@@ -1560,7 +1609,7 @@
       <w:pPr>
         <w:numPr>
           <w:ilvl w:val="0"/>
-          <w:numId w:val="1012"/>
+          <w:numId w:val="1013"/>
         </w:numPr>
         <w:pStyle w:val="Compact"/>
       </w:pPr>
@@ -1572,7 +1621,7 @@
       <w:pPr>
         <w:numPr>
           <w:ilvl w:val="0"/>
-          <w:numId w:val="1012"/>
+          <w:numId w:val="1013"/>
         </w:numPr>
         <w:pStyle w:val="Compact"/>
       </w:pPr>
@@ -1584,7 +1633,7 @@
       <w:pPr>
         <w:numPr>
           <w:ilvl w:val="0"/>
-          <w:numId w:val="1012"/>
+          <w:numId w:val="1013"/>
         </w:numPr>
         <w:pStyle w:val="Compact"/>
       </w:pPr>
@@ -1596,7 +1645,7 @@
       <w:pPr>
         <w:numPr>
           <w:ilvl w:val="0"/>
-          <w:numId w:val="1012"/>
+          <w:numId w:val="1013"/>
         </w:numPr>
         <w:pStyle w:val="Compact"/>
       </w:pPr>
@@ -1608,7 +1657,7 @@
       <w:pPr>
         <w:numPr>
           <w:ilvl w:val="0"/>
-          <w:numId w:val="1012"/>
+          <w:numId w:val="1013"/>
         </w:numPr>
         <w:pStyle w:val="Compact"/>
       </w:pPr>
@@ -1624,8 +1673,8 @@
         <w:t xml:space="preserve">이 루프는 사람이 승인한 개정만 프로덕션에 반영하며, 탐지 결과를 스스로 무비판 재학습해 자기 자신을 검증하지 않는다(자기 참조 승인 금지). Cycle마다 Recall(놓친 결함 비율 감소)과 False Positive율 변화를 함께 추적해 개선/퇴보를 판정한다.</w:t>
       </w:r>
     </w:p>
-    <w:bookmarkEnd w:id="46"/>
-    <w:bookmarkStart w:id="47" w:name="산출물-2"/>
+    <w:bookmarkEnd w:id="47"/>
+    <w:bookmarkStart w:id="48" w:name="산출물-2"/>
     <w:p>
       <w:pPr>
         <w:pStyle w:val="Heading3"/>
@@ -1642,8 +1691,8 @@
         <w:t xml:space="preserve">KnowledgePattern, MissedFinding, PatternApplicationReceipt, PatternLibraryRevision, DetectionCapabilityChangeReport</w:t>
       </w:r>
     </w:p>
-    <w:bookmarkEnd w:id="47"/>
-    <w:bookmarkStart w:id="48" w:name="수용기준-3"/>
+    <w:bookmarkEnd w:id="48"/>
+    <w:bookmarkStart w:id="49" w:name="수용기준-4"/>
     <w:p>
       <w:pPr>
         <w:pStyle w:val="Heading3"/>
@@ -1656,7 +1705,7 @@
       <w:pPr>
         <w:numPr>
           <w:ilvl w:val="0"/>
-          <w:numId w:val="1013"/>
+          <w:numId w:val="1014"/>
         </w:numPr>
         <w:pStyle w:val="Compact"/>
       </w:pPr>
@@ -1668,7 +1717,7 @@
       <w:pPr>
         <w:numPr>
           <w:ilvl w:val="0"/>
-          <w:numId w:val="1013"/>
+          <w:numId w:val="1014"/>
         </w:numPr>
         <w:pStyle w:val="Compact"/>
       </w:pPr>
@@ -1680,7 +1729,7 @@
       <w:pPr>
         <w:numPr>
           <w:ilvl w:val="0"/>
-          <w:numId w:val="1013"/>
+          <w:numId w:val="1014"/>
         </w:numPr>
         <w:pStyle w:val="Compact"/>
       </w:pPr>
@@ -1692,7 +1741,7 @@
       <w:pPr>
         <w:numPr>
           <w:ilvl w:val="0"/>
-          <w:numId w:val="1013"/>
+          <w:numId w:val="1014"/>
         </w:numPr>
         <w:pStyle w:val="Compact"/>
       </w:pPr>
@@ -1704,7 +1753,7 @@
       <w:pPr>
         <w:numPr>
           <w:ilvl w:val="0"/>
-          <w:numId w:val="1013"/>
+          <w:numId w:val="1014"/>
         </w:numPr>
         <w:pStyle w:val="Compact"/>
       </w:pPr>
@@ -1716,7 +1765,7 @@
       <w:pPr>
         <w:numPr>
           <w:ilvl w:val="0"/>
-          <w:numId w:val="1013"/>
+          <w:numId w:val="1014"/>
         </w:numPr>
         <w:pStyle w:val="Compact"/>
       </w:pPr>
@@ -1724,9 +1773,9 @@
         <w:t xml:space="preserve">MissedFinding은 발견 경로(Independent Review/Human Override/Incident/고객신고/지연 Regression)를 구분해 기록한다</w:t>
       </w:r>
     </w:p>
-    <w:bookmarkEnd w:id="48"/>
     <w:bookmarkEnd w:id="49"/>
-    <w:bookmarkStart w:id="50" w:name="oevidence"/>
+    <w:bookmarkEnd w:id="50"/>
+    <w:bookmarkStart w:id="51" w:name="oevidence"/>
     <w:p>
       <w:pPr>
         <w:pStyle w:val="Heading2"/>
@@ -1739,7 +1788,7 @@
       <w:pPr>
         <w:numPr>
           <w:ilvl w:val="0"/>
-          <w:numId w:val="1014"/>
+          <w:numId w:val="1015"/>
         </w:numPr>
         <w:pStyle w:val="Compact"/>
       </w:pPr>
@@ -1751,7 +1800,7 @@
       <w:pPr>
         <w:numPr>
           <w:ilvl w:val="0"/>
-          <w:numId w:val="1014"/>
+          <w:numId w:val="1015"/>
         </w:numPr>
         <w:pStyle w:val="Compact"/>
       </w:pPr>
@@ -1763,7 +1812,7 @@
       <w:pPr>
         <w:numPr>
           <w:ilvl w:val="0"/>
-          <w:numId w:val="1014"/>
+          <w:numId w:val="1015"/>
         </w:numPr>
         <w:pStyle w:val="Compact"/>
       </w:pPr>
@@ -1775,7 +1824,7 @@
       <w:pPr>
         <w:numPr>
           <w:ilvl w:val="0"/>
-          <w:numId w:val="1014"/>
+          <w:numId w:val="1015"/>
         </w:numPr>
         <w:pStyle w:val="Compact"/>
       </w:pPr>
@@ -1787,7 +1836,7 @@
       <w:pPr>
         <w:numPr>
           <w:ilvl w:val="0"/>
-          <w:numId w:val="1014"/>
+          <w:numId w:val="1015"/>
         </w:numPr>
         <w:pStyle w:val="Compact"/>
       </w:pPr>
@@ -1799,7 +1848,7 @@
       <w:pPr>
         <w:numPr>
           <w:ilvl w:val="0"/>
-          <w:numId w:val="1014"/>
+          <w:numId w:val="1015"/>
         </w:numPr>
         <w:pStyle w:val="Compact"/>
       </w:pPr>
@@ -1811,7 +1860,7 @@
       <w:pPr>
         <w:numPr>
           <w:ilvl w:val="0"/>
-          <w:numId w:val="1014"/>
+          <w:numId w:val="1015"/>
         </w:numPr>
         <w:pStyle w:val="Compact"/>
       </w:pPr>
@@ -1823,7 +1872,7 @@
       <w:pPr>
         <w:numPr>
           <w:ilvl w:val="0"/>
-          <w:numId w:val="1014"/>
+          <w:numId w:val="1015"/>
         </w:numPr>
         <w:pStyle w:val="Compact"/>
       </w:pPr>
@@ -1835,7 +1884,7 @@
       <w:pPr>
         <w:numPr>
           <w:ilvl w:val="0"/>
-          <w:numId w:val="1014"/>
+          <w:numId w:val="1015"/>
         </w:numPr>
         <w:pStyle w:val="Compact"/>
       </w:pPr>
@@ -1847,7 +1896,7 @@
       <w:pPr>
         <w:numPr>
           <w:ilvl w:val="0"/>
-          <w:numId w:val="1014"/>
+          <w:numId w:val="1015"/>
         </w:numPr>
         <w:pStyle w:val="Compact"/>
       </w:pPr>
@@ -1859,7 +1908,7 @@
       <w:pPr>
         <w:numPr>
           <w:ilvl w:val="0"/>
-          <w:numId w:val="1014"/>
+          <w:numId w:val="1015"/>
         </w:numPr>
         <w:pStyle w:val="Compact"/>
       </w:pPr>
@@ -1871,7 +1920,7 @@
       <w:pPr>
         <w:numPr>
           <w:ilvl w:val="0"/>
-          <w:numId w:val="1014"/>
+          <w:numId w:val="1015"/>
         </w:numPr>
         <w:pStyle w:val="Compact"/>
       </w:pPr>
@@ -1879,8 +1928,20 @@
         <w:t xml:space="preserve">Retention/Deletion Receipt</w:t>
       </w:r>
     </w:p>
-    <w:bookmarkEnd w:id="50"/>
-    <w:bookmarkStart w:id="51" w:name="ogit"/>
+    <w:p>
+      <w:pPr>
+        <w:numPr>
+          <w:ilvl w:val="0"/>
+          <w:numId w:val="1015"/>
+        </w:numPr>
+        <w:pStyle w:val="Compact"/>
+      </w:pPr>
+      <w:r>
+        <w:t xml:space="preserve">Evidence Schema Version 결속: 모든 Evidence Metadata는 schema_version을 가지며, 계약된 보존기간 동안에는 과거 schema_version의 Evidence도 검증할 수 있는 도구를 유지한다(하위호환 검증도구 없는 Schema 폐기 금지)</w:t>
+      </w:r>
+    </w:p>
+    <w:bookmarkEnd w:id="51"/>
+    <w:bookmarkStart w:id="52" w:name="ogit"/>
     <w:p>
       <w:pPr>
         <w:pStyle w:val="Heading2"/>
@@ -1893,7 +1954,7 @@
       <w:pPr>
         <w:numPr>
           <w:ilvl w:val="0"/>
-          <w:numId w:val="1015"/>
+          <w:numId w:val="1016"/>
         </w:numPr>
         <w:pStyle w:val="Compact"/>
       </w:pPr>
@@ -1905,7 +1966,7 @@
       <w:pPr>
         <w:numPr>
           <w:ilvl w:val="0"/>
-          <w:numId w:val="1015"/>
+          <w:numId w:val="1016"/>
         </w:numPr>
         <w:pStyle w:val="Compact"/>
       </w:pPr>
@@ -1917,7 +1978,7 @@
       <w:pPr>
         <w:numPr>
           <w:ilvl w:val="0"/>
-          <w:numId w:val="1015"/>
+          <w:numId w:val="1016"/>
         </w:numPr>
         <w:pStyle w:val="Compact"/>
       </w:pPr>
@@ -1929,7 +1990,7 @@
       <w:pPr>
         <w:numPr>
           <w:ilvl w:val="0"/>
-          <w:numId w:val="1015"/>
+          <w:numId w:val="1016"/>
         </w:numPr>
         <w:pStyle w:val="Compact"/>
       </w:pPr>
@@ -1941,7 +2002,7 @@
       <w:pPr>
         <w:numPr>
           <w:ilvl w:val="0"/>
-          <w:numId w:val="1015"/>
+          <w:numId w:val="1016"/>
         </w:numPr>
         <w:pStyle w:val="Compact"/>
       </w:pPr>
@@ -1953,7 +2014,7 @@
       <w:pPr>
         <w:numPr>
           <w:ilvl w:val="0"/>
-          <w:numId w:val="1015"/>
+          <w:numId w:val="1016"/>
         </w:numPr>
         <w:pStyle w:val="Compact"/>
       </w:pPr>
@@ -1965,7 +2026,7 @@
       <w:pPr>
         <w:numPr>
           <w:ilvl w:val="0"/>
-          <w:numId w:val="1015"/>
+          <w:numId w:val="1016"/>
         </w:numPr>
         <w:pStyle w:val="Compact"/>
       </w:pPr>
@@ -1977,7 +2038,7 @@
       <w:pPr>
         <w:numPr>
           <w:ilvl w:val="0"/>
-          <w:numId w:val="1015"/>
+          <w:numId w:val="1016"/>
         </w:numPr>
         <w:pStyle w:val="Compact"/>
       </w:pPr>
@@ -1989,7 +2050,7 @@
       <w:pPr>
         <w:numPr>
           <w:ilvl w:val="0"/>
-          <w:numId w:val="1015"/>
+          <w:numId w:val="1016"/>
         </w:numPr>
         <w:pStyle w:val="Compact"/>
       </w:pPr>
@@ -2001,7 +2062,7 @@
       <w:pPr>
         <w:numPr>
           <w:ilvl w:val="0"/>
-          <w:numId w:val="1015"/>
+          <w:numId w:val="1016"/>
         </w:numPr>
         <w:pStyle w:val="Compact"/>
       </w:pPr>
@@ -2013,7 +2074,7 @@
       <w:pPr>
         <w:numPr>
           <w:ilvl w:val="0"/>
-          <w:numId w:val="1015"/>
+          <w:numId w:val="1016"/>
         </w:numPr>
         <w:pStyle w:val="Compact"/>
       </w:pPr>
@@ -2025,7 +2086,7 @@
       <w:pPr>
         <w:numPr>
           <w:ilvl w:val="0"/>
-          <w:numId w:val="1015"/>
+          <w:numId w:val="1016"/>
         </w:numPr>
         <w:pStyle w:val="Compact"/>
       </w:pPr>
@@ -2037,7 +2098,7 @@
       <w:pPr>
         <w:numPr>
           <w:ilvl w:val="0"/>
-          <w:numId w:val="1015"/>
+          <w:numId w:val="1016"/>
         </w:numPr>
         <w:pStyle w:val="Compact"/>
       </w:pPr>
@@ -2049,7 +2110,7 @@
       <w:pPr>
         <w:numPr>
           <w:ilvl w:val="0"/>
-          <w:numId w:val="1015"/>
+          <w:numId w:val="1016"/>
         </w:numPr>
         <w:pStyle w:val="Compact"/>
       </w:pPr>
@@ -2061,7 +2122,7 @@
       <w:pPr>
         <w:numPr>
           <w:ilvl w:val="0"/>
-          <w:numId w:val="1015"/>
+          <w:numId w:val="1016"/>
         </w:numPr>
         <w:pStyle w:val="Compact"/>
       </w:pPr>
@@ -2073,7 +2134,7 @@
       <w:pPr>
         <w:numPr>
           <w:ilvl w:val="0"/>
-          <w:numId w:val="1015"/>
+          <w:numId w:val="1016"/>
         </w:numPr>
         <w:pStyle w:val="Compact"/>
       </w:pPr>
@@ -2081,8 +2142,8 @@
         <w:t xml:space="preserve">Multi-PR Integration Risk Scan: 동시에 열려있는 여러 Draft PR이 각각은 통과해도 함께 병합될 때 같은 Component를 상충되게 변경하는지 예측하고, 위험이 있으면 관련 PR 담당자에게 상호 링크된 경고를 표시</w:t>
       </w:r>
     </w:p>
-    <w:bookmarkEnd w:id="51"/>
-    <w:bookmarkStart w:id="52" w:name="odelivery"/>
+    <w:bookmarkEnd w:id="52"/>
+    <w:bookmarkStart w:id="53" w:name="odelivery"/>
     <w:p>
       <w:pPr>
         <w:pStyle w:val="Heading2"/>
@@ -2095,7 +2156,7 @@
       <w:pPr>
         <w:numPr>
           <w:ilvl w:val="0"/>
-          <w:numId w:val="1016"/>
+          <w:numId w:val="1017"/>
         </w:numPr>
         <w:pStyle w:val="Compact"/>
       </w:pPr>
@@ -2107,7 +2168,7 @@
       <w:pPr>
         <w:numPr>
           <w:ilvl w:val="0"/>
-          <w:numId w:val="1016"/>
+          <w:numId w:val="1017"/>
         </w:numPr>
         <w:pStyle w:val="Compact"/>
       </w:pPr>
@@ -2119,7 +2180,7 @@
       <w:pPr>
         <w:numPr>
           <w:ilvl w:val="0"/>
-          <w:numId w:val="1016"/>
+          <w:numId w:val="1017"/>
         </w:numPr>
         <w:pStyle w:val="Compact"/>
       </w:pPr>
@@ -2131,7 +2192,7 @@
       <w:pPr>
         <w:numPr>
           <w:ilvl w:val="0"/>
-          <w:numId w:val="1016"/>
+          <w:numId w:val="1017"/>
         </w:numPr>
         <w:pStyle w:val="Compact"/>
       </w:pPr>
@@ -2143,7 +2204,19 @@
       <w:pPr>
         <w:numPr>
           <w:ilvl w:val="0"/>
-          <w:numId w:val="1016"/>
+          <w:numId w:val="1017"/>
+        </w:numPr>
+        <w:pStyle w:val="Compact"/>
+      </w:pPr>
+      <w:r>
+        <w:t xml:space="preserve">CoverageReport(검토·검증 범위 포함/제외 내역)</w:t>
+      </w:r>
+    </w:p>
+    <w:p>
+      <w:pPr>
+        <w:numPr>
+          <w:ilvl w:val="0"/>
+          <w:numId w:val="1017"/>
         </w:numPr>
         <w:pStyle w:val="Compact"/>
       </w:pPr>
@@ -2155,7 +2228,7 @@
       <w:pPr>
         <w:numPr>
           <w:ilvl w:val="0"/>
-          <w:numId w:val="1016"/>
+          <w:numId w:val="1017"/>
         </w:numPr>
         <w:pStyle w:val="Compact"/>
       </w:pPr>
@@ -2167,7 +2240,7 @@
       <w:pPr>
         <w:numPr>
           <w:ilvl w:val="0"/>
-          <w:numId w:val="1016"/>
+          <w:numId w:val="1017"/>
         </w:numPr>
         <w:pStyle w:val="Compact"/>
       </w:pPr>
@@ -2179,7 +2252,7 @@
       <w:pPr>
         <w:numPr>
           <w:ilvl w:val="0"/>
-          <w:numId w:val="1016"/>
+          <w:numId w:val="1017"/>
         </w:numPr>
         <w:pStyle w:val="Compact"/>
       </w:pPr>
@@ -2191,7 +2264,7 @@
       <w:pPr>
         <w:numPr>
           <w:ilvl w:val="0"/>
-          <w:numId w:val="1016"/>
+          <w:numId w:val="1017"/>
         </w:numPr>
         <w:pStyle w:val="Compact"/>
       </w:pPr>
@@ -2203,7 +2276,7 @@
       <w:pPr>
         <w:numPr>
           <w:ilvl w:val="0"/>
-          <w:numId w:val="1016"/>
+          <w:numId w:val="1017"/>
         </w:numPr>
         <w:pStyle w:val="Compact"/>
       </w:pPr>
@@ -2211,8 +2284,8 @@
         <w:t xml:space="preserve">Deletion Receipt</w:t>
       </w:r>
     </w:p>
-    <w:bookmarkEnd w:id="52"/>
-    <w:bookmarkStart w:id="57" w:name="onotify"/>
+    <w:bookmarkEnd w:id="53"/>
+    <w:bookmarkStart w:id="58" w:name="onotify"/>
     <w:p>
       <w:pPr>
         <w:pStyle w:val="Heading2"/>
@@ -2221,7 +2294,7 @@
         <w:t xml:space="preserve">10-1. ONotify</w:t>
       </w:r>
     </w:p>
-    <w:bookmarkStart w:id="53" w:name="책임-3"/>
+    <w:bookmarkStart w:id="54" w:name="책임-3"/>
     <w:p>
       <w:pPr>
         <w:pStyle w:val="Heading3"/>
@@ -2238,8 +2311,8 @@
         <w:t xml:space="preserve">Case, Finding, License의 중요 상태 변화를 구독 채널로 능동 통지한다(FR-COM-011).</w:t>
       </w:r>
     </w:p>
-    <w:bookmarkEnd w:id="53"/>
-    <w:bookmarkStart w:id="54" w:name="기능-5"/>
+    <w:bookmarkEnd w:id="54"/>
+    <w:bookmarkStart w:id="55" w:name="기능-5"/>
     <w:p>
       <w:pPr>
         <w:pStyle w:val="Heading3"/>
@@ -2252,7 +2325,7 @@
       <w:pPr>
         <w:numPr>
           <w:ilvl w:val="0"/>
-          <w:numId w:val="1017"/>
+          <w:numId w:val="1018"/>
         </w:numPr>
         <w:pStyle w:val="Compact"/>
       </w:pPr>
@@ -2264,7 +2337,7 @@
       <w:pPr>
         <w:numPr>
           <w:ilvl w:val="0"/>
-          <w:numId w:val="1017"/>
+          <w:numId w:val="1018"/>
         </w:numPr>
         <w:pStyle w:val="Compact"/>
       </w:pPr>
@@ -2276,7 +2349,7 @@
       <w:pPr>
         <w:numPr>
           <w:ilvl w:val="0"/>
-          <w:numId w:val="1017"/>
+          <w:numId w:val="1018"/>
         </w:numPr>
         <w:pStyle w:val="Compact"/>
       </w:pPr>
@@ -2288,7 +2361,7 @@
       <w:pPr>
         <w:numPr>
           <w:ilvl w:val="0"/>
-          <w:numId w:val="1017"/>
+          <w:numId w:val="1018"/>
         </w:numPr>
         <w:pStyle w:val="Compact"/>
       </w:pPr>
@@ -2300,7 +2373,7 @@
       <w:pPr>
         <w:numPr>
           <w:ilvl w:val="0"/>
-          <w:numId w:val="1017"/>
+          <w:numId w:val="1018"/>
         </w:numPr>
         <w:pStyle w:val="Compact"/>
       </w:pPr>
@@ -2323,8 +2396,8 @@
         <w:t xml:space="preserve">을 감사 가능하게 함</w:t>
       </w:r>
     </w:p>
-    <w:bookmarkEnd w:id="54"/>
-    <w:bookmarkStart w:id="55" w:name="산출물-3"/>
+    <w:bookmarkEnd w:id="55"/>
+    <w:bookmarkStart w:id="56" w:name="산출물-3"/>
     <w:p>
       <w:pPr>
         <w:pStyle w:val="Heading3"/>
@@ -2341,8 +2414,8 @@
         <w:t xml:space="preserve">NotificationRule, NotificationEvent, NotificationDeliveryReceipt</w:t>
       </w:r>
     </w:p>
-    <w:bookmarkEnd w:id="55"/>
-    <w:bookmarkStart w:id="56" w:name="수용기준-4"/>
+    <w:bookmarkEnd w:id="56"/>
+    <w:bookmarkStart w:id="57" w:name="수용기준-5"/>
     <w:p>
       <w:pPr>
         <w:pStyle w:val="Heading3"/>
@@ -2355,7 +2428,7 @@
       <w:pPr>
         <w:numPr>
           <w:ilvl w:val="0"/>
-          <w:numId w:val="1018"/>
+          <w:numId w:val="1019"/>
         </w:numPr>
         <w:pStyle w:val="Compact"/>
       </w:pPr>
@@ -2367,7 +2440,7 @@
       <w:pPr>
         <w:numPr>
           <w:ilvl w:val="0"/>
-          <w:numId w:val="1018"/>
+          <w:numId w:val="1019"/>
         </w:numPr>
         <w:pStyle w:val="Compact"/>
       </w:pPr>
@@ -2379,7 +2452,7 @@
       <w:pPr>
         <w:numPr>
           <w:ilvl w:val="0"/>
-          <w:numId w:val="1018"/>
+          <w:numId w:val="1019"/>
         </w:numPr>
         <w:pStyle w:val="Compact"/>
       </w:pPr>
@@ -2387,9 +2460,9 @@
         <w:t xml:space="preserve">고객이 구독하지 않은 채널로는 발송하지 않는다(Opt-in 채널만 사용)</w:t>
       </w:r>
     </w:p>
-    <w:bookmarkEnd w:id="56"/>
     <w:bookmarkEnd w:id="57"/>
-    <w:bookmarkStart w:id="58" w:name="비기능-요구사항"/>
+    <w:bookmarkEnd w:id="58"/>
+    <w:bookmarkStart w:id="59" w:name="비기능-요구사항"/>
     <w:p>
       <w:pPr>
         <w:pStyle w:val="Heading2"/>
@@ -2402,7 +2475,7 @@
       <w:pPr>
         <w:numPr>
           <w:ilvl w:val="0"/>
-          <w:numId w:val="1019"/>
+          <w:numId w:val="1020"/>
         </w:numPr>
         <w:pStyle w:val="Compact"/>
       </w:pPr>
@@ -2414,7 +2487,7 @@
       <w:pPr>
         <w:numPr>
           <w:ilvl w:val="0"/>
-          <w:numId w:val="1019"/>
+          <w:numId w:val="1020"/>
         </w:numPr>
         <w:pStyle w:val="Compact"/>
       </w:pPr>
@@ -2426,7 +2499,7 @@
       <w:pPr>
         <w:numPr>
           <w:ilvl w:val="0"/>
-          <w:numId w:val="1019"/>
+          <w:numId w:val="1020"/>
         </w:numPr>
         <w:pStyle w:val="Compact"/>
       </w:pPr>
@@ -2438,95 +2511,95 @@
       <w:pPr>
         <w:numPr>
           <w:ilvl w:val="1"/>
+          <w:numId w:val="1021"/>
+        </w:numPr>
+        <w:pStyle w:val="Compact"/>
+      </w:pPr>
+      <w:r>
+        <w:t xml:space="preserve">Learning: 100만 LOC 기준 8시간 이내 최초 완료, 이후 증분 학습은 변경분 10만 LOC 기준 30분 이내</w:t>
+      </w:r>
+    </w:p>
+    <w:p>
+      <w:pPr>
+        <w:numPr>
+          <w:ilvl w:val="1"/>
+          <w:numId w:val="1021"/>
+        </w:numPr>
+        <w:pStyle w:val="Compact"/>
+      </w:pPr>
+      <w:r>
+        <w:t xml:space="preserve">Continuous Review(VS Code Fast Review): Diff 저장 후 5초 이내 1차 결과</w:t>
+      </w:r>
+    </w:p>
+    <w:p>
+      <w:pPr>
+        <w:numPr>
+          <w:ilvl w:val="1"/>
+          <w:numId w:val="1021"/>
+        </w:numPr>
+        <w:pStyle w:val="Compact"/>
+      </w:pPr>
+      <w:r>
+        <w:t xml:space="preserve">Verification Scenario 실행: Verification Pack 1개당 평균 15분 이내, 병렬 실행 시 Case당 동시 Scenario 20개 이상 지원</w:t>
+      </w:r>
+    </w:p>
+    <w:p>
+      <w:pPr>
+        <w:numPr>
+          <w:ilvl w:val="1"/>
+          <w:numId w:val="1021"/>
+        </w:numPr>
+        <w:pStyle w:val="Compact"/>
+      </w:pPr>
+      <w:r>
+        <w:t xml:space="preserve">Preflight 예상량 응답: 대상 Repository 접근 후 10분 이내</w:t>
+      </w:r>
+    </w:p>
+    <w:p>
+      <w:pPr>
+        <w:numPr>
+          <w:ilvl w:val="0"/>
           <w:numId w:val="1020"/>
         </w:numPr>
         <w:pStyle w:val="Compact"/>
       </w:pPr>
       <w:r>
-        <w:t xml:space="preserve">Learning: 100만 LOC 기준 8시간 이내 최초 완료, 이후 증분 학습은 변경분 10만 LOC 기준 30분 이내</w:t>
-      </w:r>
-    </w:p>
-    <w:p>
-      <w:pPr>
-        <w:numPr>
-          <w:ilvl w:val="1"/>
+        <w:t xml:space="preserve">NFR-AVAIL: SaaS Control Plane 월간 가용성 99.9%, API 요청 기준 Rate Limit과 Tenant별 동시 실행 상한을 적용해 특정 고객의 폭주가 다른 Tenant에 영향을 주지 않는다</w:t>
+      </w:r>
+    </w:p>
+    <w:p>
+      <w:pPr>
+        <w:numPr>
+          <w:ilvl w:val="0"/>
           <w:numId w:val="1020"/>
         </w:numPr>
         <w:pStyle w:val="Compact"/>
       </w:pPr>
       <w:r>
-        <w:t xml:space="preserve">Continuous Review(VS Code Fast Review): Diff 저장 후 5초 이내 1차 결과</w:t>
-      </w:r>
-    </w:p>
-    <w:p>
-      <w:pPr>
-        <w:numPr>
-          <w:ilvl w:val="1"/>
+        <w:t xml:space="preserve">NFR-AUDIT: 모든 권한·실행·변경 감사</w:t>
+      </w:r>
+    </w:p>
+    <w:p>
+      <w:pPr>
+        <w:numPr>
+          <w:ilvl w:val="0"/>
           <w:numId w:val="1020"/>
         </w:numPr>
         <w:pStyle w:val="Compact"/>
       </w:pPr>
       <w:r>
-        <w:t xml:space="preserve">Verification Scenario 실행: Verification Pack 1개당 평균 15분 이내, 병렬 실행 시 Case당 동시 Scenario 20개 이상 지원</w:t>
-      </w:r>
-    </w:p>
-    <w:p>
-      <w:pPr>
-        <w:numPr>
-          <w:ilvl w:val="1"/>
+        <w:t xml:space="preserve">NFR-PORT: SaaS, Local Runtime, 폐쇄망 배포 가능</w:t>
+      </w:r>
+    </w:p>
+    <w:p>
+      <w:pPr>
+        <w:numPr>
+          <w:ilvl w:val="0"/>
           <w:numId w:val="1020"/>
         </w:numPr>
         <w:pStyle w:val="Compact"/>
       </w:pPr>
       <w:r>
-        <w:t xml:space="preserve">Preflight 예상량 응답: 대상 Repository 접근 후 10분 이내</w:t>
-      </w:r>
-    </w:p>
-    <w:p>
-      <w:pPr>
-        <w:numPr>
-          <w:ilvl w:val="0"/>
-          <w:numId w:val="1019"/>
-        </w:numPr>
-        <w:pStyle w:val="Compact"/>
-      </w:pPr>
-      <w:r>
-        <w:t xml:space="preserve">NFR-AVAIL: SaaS Control Plane 월간 가용성 99.9%, API 요청 기준 Rate Limit과 Tenant별 동시 실행 상한을 적용해 특정 고객의 폭주가 다른 Tenant에 영향을 주지 않는다</w:t>
-      </w:r>
-    </w:p>
-    <w:p>
-      <w:pPr>
-        <w:numPr>
-          <w:ilvl w:val="0"/>
-          <w:numId w:val="1019"/>
-        </w:numPr>
-        <w:pStyle w:val="Compact"/>
-      </w:pPr>
-      <w:r>
-        <w:t xml:space="preserve">NFR-AUDIT: 모든 권한·실행·변경 감사</w:t>
-      </w:r>
-    </w:p>
-    <w:p>
-      <w:pPr>
-        <w:numPr>
-          <w:ilvl w:val="0"/>
-          <w:numId w:val="1019"/>
-        </w:numPr>
-        <w:pStyle w:val="Compact"/>
-      </w:pPr>
-      <w:r>
-        <w:t xml:space="preserve">NFR-PORT: SaaS, Local Runtime, 폐쇄망 배포 가능</w:t>
-      </w:r>
-    </w:p>
-    <w:p>
-      <w:pPr>
-        <w:numPr>
-          <w:ilvl w:val="0"/>
-          <w:numId w:val="1019"/>
-        </w:numPr>
-        <w:pStyle w:val="Compact"/>
-      </w:pPr>
-      <w:r>
         <w:t xml:space="preserve">NFR-PRIV: 고객별 보존기간과 완전 삭제 증명</w:t>
       </w:r>
     </w:p>
@@ -2534,7 +2607,7 @@
       <w:pPr>
         <w:numPr>
           <w:ilvl w:val="0"/>
-          <w:numId w:val="1019"/>
+          <w:numId w:val="1020"/>
         </w:numPr>
         <w:pStyle w:val="Compact"/>
       </w:pPr>
@@ -2546,7 +2619,7 @@
       <w:pPr>
         <w:numPr>
           <w:ilvl w:val="0"/>
-          <w:numId w:val="1019"/>
+          <w:numId w:val="1020"/>
         </w:numPr>
         <w:pStyle w:val="Compact"/>
       </w:pPr>
@@ -2554,8 +2627,8 @@
         <w:t xml:space="preserve">NFR-ACCESS: 관리자·개발자·감사자 역할 분리</w:t>
       </w:r>
     </w:p>
-    <w:bookmarkEnd w:id="58"/>
-    <w:bookmarkStart w:id="59" w:name="추적성"/>
+    <w:bookmarkEnd w:id="59"/>
+    <w:bookmarkStart w:id="60" w:name="추적성"/>
     <w:p>
       <w:pPr>
         <w:pStyle w:val="Heading2"/>
@@ -2572,8 +2645,8 @@
         <w:t xml:space="preserve">Requirement → Design Component → Code Module → Test Case → Evidence → Release를 단일 ID 체계로 연결한다.</w:t>
       </w:r>
     </w:p>
-    <w:bookmarkEnd w:id="59"/>
     <w:bookmarkEnd w:id="60"/>
+    <w:bookmarkEnd w:id="61"/>
     <w:sectPr/>
   </w:body>
 </w:document>
@@ -2878,6 +2951,9 @@
     <w:abstractNumId w:val="991"/>
   </w:num>
   <w:num w:numId="1012">
+    <w:abstractNumId w:val="991"/>
+  </w:num>
+  <w:num w:numId="1013">
     <w:abstractNumId w:val="99411"/>
     <w:lvlOverride w:ilvl="0">
       <w:startOverride w:val="1"/>
@@ -2907,9 +2983,6 @@
       <w:startOverride w:val="1"/>
     </w:lvlOverride>
   </w:num>
-  <w:num w:numId="1013">
-    <w:abstractNumId w:val="991"/>
-  </w:num>
   <w:num w:numId="1014">
     <w:abstractNumId w:val="991"/>
   </w:num>
@@ -2929,6 +3002,9 @@
     <w:abstractNumId w:val="991"/>
   </w:num>
   <w:num w:numId="1020">
+    <w:abstractNumId w:val="991"/>
+  </w:num>
+  <w:num w:numId="1021">
     <w:abstractNumId w:val="991"/>
   </w:num>
 </w:numbering>

</xml_diff>

<commit_message>
docs: add external acceptance certificate for third-party procurers
- New External Acceptor actor: a third party (e.g. a procuring agency
  accepting delivered software, an explicit target customer segment that
  previously had no supporting workflow) who reviews a Delivery without
  holding a paid ONSure account
- Acceptance Certificate: a signed summary attestation of a Case's Baseline,
  policy basis, and result, verifiable via a public no-auth endpoint without
  exposing source code or Finding detail; the one documented exception to
  the API's authentication requirement
- FR-COM-009: carve out publicly-sourced CVE/vulnerability patterns from the
  shared-corpus opt-out, since they don't originate from observing customer
  code and should stay current regardless of an organization's opt-out
- Fixture for certificate tamper/forgery rejection
- Regenerate docs/master/doc/*.docx

Co-Authored-By: Claude Sonnet 5 <noreply@anthropic.com>
</commit_message>
<xml_diff>
--- a/docs/master/doc/02_FUNCTIONAL_REQUIREMENTS_AND_PROGRAMS.docx
+++ b/docs/master/doc/02_FUNCTIONAL_REQUIREMENTS_AND_PROGRAMS.docx
@@ -121,6 +121,18 @@
         <w:pStyle w:val="Compact"/>
       </w:pPr>
       <w:r>
+        <w:t xml:space="preserve">External Acceptor: 고객 소프트웨어를 인수·검수하는 발주기관 등 제3자. Customer Owner가 초대한 범위에서 Delivery와 Acceptance Certificate만 읽기 전용으로 열람하며 ONSure 유료 계정이 없어도 됨</w:t>
+      </w:r>
+    </w:p>
+    <w:p>
+      <w:pPr>
+        <w:numPr>
+          <w:ilvl w:val="0"/>
+          <w:numId w:val="1001"/>
+        </w:numPr>
+        <w:pStyle w:val="Compact"/>
+      </w:pPr>
+      <w:r>
         <w:t xml:space="preserve">OLicense: 라이선스·Entitlement·Credit 권위</w:t>
       </w:r>
     </w:p>
@@ -251,7 +263,7 @@
         <w:pStyle w:val="Compact"/>
       </w:pPr>
       <w:r>
-        <w:t xml:space="preserve">FR-COM-009 Organization은 자신의 Pattern/Fixture가 익명화된 공유 Corpus에 기여할지 여부를 명시적으로 선택(Opt-in/Opt-out)하며 기본값은 Opt-out이다. 규제산업 Enterprise Edition은 공유 Corpus 기여를 계약으로 원천 차단할 수 있다.</w:t>
+        <w:t xml:space="preserve">FR-COM-009 Organization은 자신의 Pattern/Fixture가 익명화된 공유 Corpus에 기여할지 여부를 명시적으로 선택(Opt-in/Opt-out)하며 기본값은 Opt-out이다. 규제산업 Enterprise Edition은 공유 Corpus 기여를 계약으로 원천 차단할 수 있다. 단, 공개 CVE/취약점 DB 등 이미 공개된 정보에서 유래한 Pattern(고객 코드의 행위·구조를 관찰해 만든 Pattern이 아닌 것)은 고객 코드 관찰과 무관하므로 이 Opt-out 대상에서 제외하고 항상 최신으로 유지한다.</w:t>
       </w:r>
     </w:p>
     <w:p>
@@ -2210,6 +2222,33 @@
       </w:pPr>
       <w:r>
         <w:t xml:space="preserve">CoverageReport(검토·검증 범위 포함/제외 내역)</w:t>
+      </w:r>
+    </w:p>
+    <w:p>
+      <w:pPr>
+        <w:numPr>
+          <w:ilvl w:val="0"/>
+          <w:numId w:val="1017"/>
+        </w:numPr>
+        <w:pStyle w:val="Compact"/>
+      </w:pPr>
+      <w:r>
+        <w:t xml:space="preserve">Acceptance Certificate: 발주기관 등 제3자(External Acceptor)가 소스나 Finding 상세 없이도 서명 검증만으로</w:t>
+      </w:r>
+      <w:r>
+        <w:t xml:space="preserve"> </w:t>
+      </w:r>
+      <w:r>
+        <w:t xml:space="preserve">“</w:t>
+      </w:r>
+      <w:r>
+        <w:t xml:space="preserve">이 Baseline이 이 시점에 이런 정책·기준으로 이런 결과를 받았다</w:t>
+      </w:r>
+      <w:r>
+        <w:t xml:space="preserve">”</w:t>
+      </w:r>
+      <w:r>
+        <w:t xml:space="preserve">를 확인할 수 있는 요약 증명서. 공개 검증 엔드포인트로 인증 없이 서명 유효성만 확인 가능하며, Evidence Pack 전체 열람은 권한자만 가능</w:t>
       </w:r>
     </w:p>
     <w:p>

</xml_diff>

<commit_message>
docs: add bulk finding triage and periodic evidence reproducibility audit
- Finding Explorer: bulk accept-risk/false-positive over filtered results,
  saved filter views, CSV export/re-import for large legacy codebases;
  Critical/High bulk accept-risk still requires the individual risky-action
  confirmation, not a blanket bypass
- OEvidence: periodically re-execute a sample of past Evidence (same input,
  policy, tool version) to confirm identical judgments reproduce, giving
  the business plan's "Evidence reproduction success rate" KPI an actual
  measurement mechanism instead of being an unmeasured aspiration
- Regenerate docs/master/doc/*.docx

Co-Authored-By: Claude Sonnet 5 <noreply@anthropic.com>
</commit_message>
<xml_diff>
--- a/docs/master/doc/02_FUNCTIONAL_REQUIREMENTS_AND_PROGRAMS.docx
+++ b/docs/master/doc/02_FUNCTIONAL_REQUIREMENTS_AND_PROGRAMS.docx
@@ -10,7 +10,7 @@
         <w:t xml:space="preserve">02_FUNCTIONAL_REQUIREMENTS_AND_PROGRAMS</w:t>
       </w:r>
     </w:p>
-    <w:bookmarkStart w:id="61" w:name="onsure-기능-요구사항-및-프로그램-명세"/>
+    <w:bookmarkStart w:id="62" w:name="onsure-기능-요구사항-및-프로그램-명세"/>
     <w:p>
       <w:pPr>
         <w:pStyle w:val="Heading1"/>
@@ -1787,7 +1787,7 @@
     </w:p>
     <w:bookmarkEnd w:id="49"/>
     <w:bookmarkEnd w:id="50"/>
-    <w:bookmarkStart w:id="51" w:name="oevidence"/>
+    <w:bookmarkStart w:id="52" w:name="oevidence"/>
     <w:p>
       <w:pPr>
         <w:pStyle w:val="Heading2"/>
@@ -1952,8 +1952,52 @@
         <w:t xml:space="preserve">Evidence Schema Version 결속: 모든 Evidence Metadata는 schema_version을 가지며, 계약된 보존기간 동안에는 과거 schema_version의 Evidence도 검증할 수 있는 도구를 유지한다(하위호환 검증도구 없는 Schema 폐기 금지)</w:t>
       </w:r>
     </w:p>
-    <w:bookmarkEnd w:id="51"/>
-    <w:bookmarkStart w:id="52" w:name="ogit"/>
+    <w:p>
+      <w:pPr>
+        <w:numPr>
+          <w:ilvl w:val="0"/>
+          <w:numId w:val="1015"/>
+        </w:numPr>
+        <w:pStyle w:val="Compact"/>
+      </w:pPr>
+      <w:r>
+        <w:t xml:space="preserve">정기 Evidence 재현성 감사: 표본 추출한 과거 Evidence의 입력·정책·도구 버전으로 재실행해 동일 판정이 재현되는지 주기적으로 확인하고,</w:t>
+      </w:r>
+      <w:r>
+        <w:t xml:space="preserve"> </w:t>
+      </w:r>
+      <w:hyperlink r:id="rId51">
+        <w:r>
+          <w:rPr>
+            <w:rStyle w:val="Hyperlink"/>
+          </w:rPr>
+          <w:t xml:space="preserve">01_BUSINESS_PRODUCT_SERVICE_PLAN.md</w:t>
+        </w:r>
+      </w:hyperlink>
+      <w:r>
+        <w:t xml:space="preserve"> </w:t>
+      </w:r>
+      <w:r>
+        <w:t xml:space="preserve">KPI</w:t>
+      </w:r>
+      <w:r>
+        <w:t xml:space="preserve"> </w:t>
+      </w:r>
+      <w:r>
+        <w:t xml:space="preserve">“</w:t>
+      </w:r>
+      <w:r>
+        <w:t xml:space="preserve">Evidence 재현 성공률</w:t>
+      </w:r>
+      <w:r>
+        <w:t xml:space="preserve">”</w:t>
+      </w:r>
+      <w:r>
+        <w:t xml:space="preserve">의 실측 근거로 삼는다(FR-COM-005가 실제로 지켜지고 있는지 스스로 검증)</w:t>
+      </w:r>
+    </w:p>
+    <w:bookmarkEnd w:id="52"/>
+    <w:bookmarkStart w:id="53" w:name="ogit"/>
     <w:p>
       <w:pPr>
         <w:pStyle w:val="Heading2"/>
@@ -2154,8 +2198,8 @@
         <w:t xml:space="preserve">Multi-PR Integration Risk Scan: 동시에 열려있는 여러 Draft PR이 각각은 통과해도 함께 병합될 때 같은 Component를 상충되게 변경하는지 예측하고, 위험이 있으면 관련 PR 담당자에게 상호 링크된 경고를 표시</w:t>
       </w:r>
     </w:p>
-    <w:bookmarkEnd w:id="52"/>
-    <w:bookmarkStart w:id="53" w:name="odelivery"/>
+    <w:bookmarkEnd w:id="53"/>
+    <w:bookmarkStart w:id="54" w:name="odelivery"/>
     <w:p>
       <w:pPr>
         <w:pStyle w:val="Heading2"/>
@@ -2323,8 +2367,8 @@
         <w:t xml:space="preserve">Deletion Receipt</w:t>
       </w:r>
     </w:p>
-    <w:bookmarkEnd w:id="53"/>
-    <w:bookmarkStart w:id="58" w:name="onotify"/>
+    <w:bookmarkEnd w:id="54"/>
+    <w:bookmarkStart w:id="59" w:name="onotify"/>
     <w:p>
       <w:pPr>
         <w:pStyle w:val="Heading2"/>
@@ -2333,7 +2377,7 @@
         <w:t xml:space="preserve">10-1. ONotify</w:t>
       </w:r>
     </w:p>
-    <w:bookmarkStart w:id="54" w:name="책임-3"/>
+    <w:bookmarkStart w:id="55" w:name="책임-3"/>
     <w:p>
       <w:pPr>
         <w:pStyle w:val="Heading3"/>
@@ -2350,8 +2394,8 @@
         <w:t xml:space="preserve">Case, Finding, License의 중요 상태 변화를 구독 채널로 능동 통지한다(FR-COM-011).</w:t>
       </w:r>
     </w:p>
-    <w:bookmarkEnd w:id="54"/>
-    <w:bookmarkStart w:id="55" w:name="기능-5"/>
+    <w:bookmarkEnd w:id="55"/>
+    <w:bookmarkStart w:id="56" w:name="기능-5"/>
     <w:p>
       <w:pPr>
         <w:pStyle w:val="Heading3"/>
@@ -2435,8 +2479,8 @@
         <w:t xml:space="preserve">을 감사 가능하게 함</w:t>
       </w:r>
     </w:p>
-    <w:bookmarkEnd w:id="55"/>
-    <w:bookmarkStart w:id="56" w:name="산출물-3"/>
+    <w:bookmarkEnd w:id="56"/>
+    <w:bookmarkStart w:id="57" w:name="산출물-3"/>
     <w:p>
       <w:pPr>
         <w:pStyle w:val="Heading3"/>
@@ -2453,8 +2497,8 @@
         <w:t xml:space="preserve">NotificationRule, NotificationEvent, NotificationDeliveryReceipt</w:t>
       </w:r>
     </w:p>
-    <w:bookmarkEnd w:id="56"/>
-    <w:bookmarkStart w:id="57" w:name="수용기준-5"/>
+    <w:bookmarkEnd w:id="57"/>
+    <w:bookmarkStart w:id="58" w:name="수용기준-5"/>
     <w:p>
       <w:pPr>
         <w:pStyle w:val="Heading3"/>
@@ -2499,9 +2543,9 @@
         <w:t xml:space="preserve">고객이 구독하지 않은 채널로는 발송하지 않는다(Opt-in 채널만 사용)</w:t>
       </w:r>
     </w:p>
-    <w:bookmarkEnd w:id="57"/>
     <w:bookmarkEnd w:id="58"/>
-    <w:bookmarkStart w:id="59" w:name="비기능-요구사항"/>
+    <w:bookmarkEnd w:id="59"/>
+    <w:bookmarkStart w:id="60" w:name="비기능-요구사항"/>
     <w:p>
       <w:pPr>
         <w:pStyle w:val="Heading2"/>
@@ -2666,8 +2710,8 @@
         <w:t xml:space="preserve">NFR-ACCESS: 관리자·개발자·감사자 역할 분리</w:t>
       </w:r>
     </w:p>
-    <w:bookmarkEnd w:id="59"/>
-    <w:bookmarkStart w:id="60" w:name="추적성"/>
+    <w:bookmarkEnd w:id="60"/>
+    <w:bookmarkStart w:id="61" w:name="추적성"/>
     <w:p>
       <w:pPr>
         <w:pStyle w:val="Heading2"/>
@@ -2684,8 +2728,8 @@
         <w:t xml:space="preserve">Requirement → Design Component → Code Module → Test Case → Evidence → Release를 단일 ID 체계로 연결한다.</w:t>
       </w:r>
     </w:p>
-    <w:bookmarkEnd w:id="60"/>
     <w:bookmarkEnd w:id="61"/>
+    <w:bookmarkEnd w:id="62"/>
     <w:sectPr/>
   </w:body>
 </w:document>

</xml_diff>

<commit_message>
docs: add RAG data ownership separation to OTraining
Read docs/architecture/ONSURE_PROGRAM_RAG_ENVIRONMENT_v1.md and
ONSURE_RAG_ADVERSARIAL_MATERIAL_PREPARATION_v1.md. Two things OTraining
was missing:

- Ownership split: ONSure's own RAG candidates (from its own verification/
  learning) live in ONSure's repo; a target program's actual RAG training
  material stays owned in the target's own .onsure/rag-preparation/, not
  centralized into ONSure. Environment Bootstrap requires separate
  explicit approval and must never be presented as actual ingestion/
  indexing/embedding/fine-tuning/application.
- Adversarial training material gets its own readiness state (COMPLETE/
  PARTIAL/MISSING/DUPLICATE/STALE) before it's eligible for RAG intake;
  anything short of COMPLETE stays HOLD.

Co-Authored-By: Claude Sonnet 5 <noreply@anthropic.com>
</commit_message>
<xml_diff>
--- a/docs/master/doc/02_FUNCTIONAL_REQUIREMENTS_AND_PROGRAMS.docx
+++ b/docs/master/doc/02_FUNCTIONAL_REQUIREMENTS_AND_PROGRAMS.docx
@@ -2641,7 +2641,49 @@
         <w:pStyle w:val="Compact"/>
       </w:pPr>
       <w:r>
-        <w:t xml:space="preserve">학습 데이터 품질 검사: 편향·중복·유출·오염(Poisoning) 여부 확인</w:t>
+        <w:t xml:space="preserve">RAG 학습자료 소유권 분리(</w:t>
+      </w:r>
+      <w:r>
+        <w:rPr>
+          <w:rStyle w:val="VerbatimChar"/>
+        </w:rPr>
+        <w:t xml:space="preserve">docs/architecture/ONSURE_PROGRAM_RAG_ENVIRONMENT_v1.md</w:t>
+      </w:r>
+      <w:r>
+        <w:t xml:space="preserve">에서 흡수): ONSure 자신의 검증·학습에서 나온 RAG 후보는 ONSure 저장소에서 관리하고, 대상 프로그램의 실제 RAG 학습자료는 대상 프로그램의</w:t>
+      </w:r>
+      <w:r>
+        <w:t xml:space="preserve"> </w:t>
+      </w:r>
+      <w:r>
+        <w:rPr>
+          <w:rStyle w:val="VerbatimChar"/>
+        </w:rPr>
+        <w:t xml:space="preserve">.onsure/rag-preparation/</w:t>
+      </w:r>
+      <w:r>
+        <w:t xml:space="preserve">에서 대상이 소유한다 — ONSure가 고객의 학습자료를 중앙으로 가져와 소유하지 않는다. 환경 생성(Bootstrap)은 검증과 분리된 명시적 승인 후에만 하며, Bootstrap 자체를 실제 적재·Index 생성·Embedding·파인튜닝·적용으로 표시하지 않는다</w:t>
+      </w:r>
+    </w:p>
+    <w:p>
+      <w:pPr>
+        <w:numPr>
+          <w:ilvl w:val="0"/>
+          <w:numId w:val="1014"/>
+        </w:numPr>
+        <w:pStyle w:val="Compact"/>
+      </w:pPr>
+      <w:r>
+        <w:t xml:space="preserve">학습 데이터 품질 검사: 편향·중복·유출·오염(Poisoning) 여부 확인. 오염 검증 자료 자체도 COMPLETE/PARTIAL/MISSING/DUPLICATE/STALE로 준비상태를 판정하며 PARTIAL/MISSING/DUPLICATE/STALE는 투입 자격을 HOLD로 둔다(</w:t>
+      </w:r>
+      <w:r>
+        <w:rPr>
+          <w:rStyle w:val="VerbatimChar"/>
+        </w:rPr>
+        <w:t xml:space="preserve">docs/architecture/ONSURE_RAG_ADVERSARIAL_MATERIAL_PREPARATION_v1.md</w:t>
+      </w:r>
+      <w:r>
+        <w:t xml:space="preserve">)</w:t>
       </w:r>
     </w:p>
     <w:p>

</xml_diff>